<commit_message>
Proofcheck Flour Play Spanish: SIGNIFICANT (29 fixes)
Co-Authored-By: Claude Opus 5.5 <noreply@anthropic.com>
Claude-Session: https://claude.ai/code/session_012Cm8JxdqzjuttdUSdkQCUg
</commit_message>
<xml_diff>
--- a/translated/corrected/Flour Play - ASSEMBLED - FORMATTED_Spanish.docx
+++ b/translated/corrected/Flour Play - ASSEMBLED - FORMATTED_Spanish.docx
@@ -209,7 +209,7 @@
     <w:p/>
     <w:p>
       <w:r>
-        <w:t xml:space="preserve">Dot soltó su risa corta y seca desde el otro lado del círculo, sin apartar los ojos de su corona, que ya era la mitad más grande que la de cualquier otra y el doble de densa.</w:t>
+        <w:t xml:space="preserve">Dot soltó su risa corta y seca desde el otro lado del círculo, sin apartar los ojos de su corona, que ya era una vez y media más grande que la de cualquier otra y el doble de densa.</w:t>
       </w:r>
     </w:p>
     <w:p/>
@@ -317,7 +317,7 @@
     <w:p/>
     <w:p>
       <w:r>
-        <w:t>—Y hay galletas de jengibre al fondo, así que ni se os ocurra coger solo las magdalenas y dejar las galletas, Dot; te vi hacerlo en el Grange y no lo he olvidado.</w:t>
+        <w:t xml:space="preserve">—Y hay galletas de jengibre al fondo, así que ni se os ocurra coger solo las magdalenas y dejar las galletas, Dot; te vi hacerlo en la Grange y no lo he olvidado.</w:t>
       </w:r>
     </w:p>
     <w:p/>
@@ -407,7 +407,7 @@
     <w:p/>
     <w:p>
       <w:r>
-        <w:t>—Bueno, sea quien sea —dijo Greta con comodidad, recogiendo las servilletas—, querrá comer igual que cualquier otro. Les llevaré un pastel el día que abran.</w:t>
+        <w:t xml:space="preserve">—Bueno, sea quien sea —dijo Greta con comodidad, recogiendo las servilletas—, querrá comer igual que cualquier otro. Les llevaré una tarta el día que abran.</w:t>
       </w:r>
     </w:p>
     <w:p/>
@@ -813,7 +813,7 @@
     <w:p/>
     <w:p>
       <w:r>
-        <w:t xml:space="preserve">—Solo lo que se oye. —Renée extendió sus frías manos, rebosante de simpatía—. Su puerta ha estado cerrada toda la mañana, y los repartidores de pan dicen que ha tenido una mala racha. Hornadas que salen mal, ese tipo de desagradables imprevistos. De verdad que lo siento por ella. —Sacudió la cabeza—. Aunque le diré que, en este negocio, en cuanto el nombre de una cocina se pone en entredicho… —me miró, franca y pesarosa, como una profesional que le hace una confidencia a una amiga—, la gente habla, ¿verdad? No es justo, pero así son las cosas. Una panadería vive de su nombre. Dejas entrar una duda y es un suplicio volver a sacarla. —Sonrió—. Pero mírame a mí, hablando de negocios cuando solo ha venido a saludar. Pase. Quiero que vea los hornos.</w:t>
+        <w:t xml:space="preserve">—Solo lo que se oye. —Renée extendió sus frías manos, rebosante de simpatía—. Su puerta ha estado cerrada toda la mañana, y los repartidores de pan dicen que ha tenido una mala racha. Hornadas que salen mal, ese tipo de desagradables imprevistos. De verdad que lo siento por ella. —Sacudió la cabeza—. Aunque le diré que, en este negocio, en cuanto el nombre de una cocina se pone en entredicho… —me miró, franca y pesarosa, como una profesional que le hace una confidencia a una amiga—, la gente habla, ¿verdad? No es justo, pero así son las cosas. Una panadería vive de su nombre. Dejas entrar una duda y es un suplicio volver a sacarla. —Sonrió—. Pero míreme a mí, hablando de negocios cuando solo ha venido a saludar. Pase. Quiero que vea los hornos.</w:t>
       </w:r>
     </w:p>
     <w:p/>
@@ -1654,7 +1654,7 @@
     </w:p>
     <w:p>
       <w:r>
-        <w:t xml:space="preserve">—No depende de ti, pero yo no lo dejaré salir —dijo Ellie, tranquila y aliviada, como si hubiera querido que alguien le dijera que no tenía que cargar con eso—. Solo quería decirlo en voz alta para que todas pudiéramos avergonzarnos de ello.</w:t>
+        <w:t xml:space="preserve">—No saldrá de aquí, y yo no seré quien lo saque —dijo Ellie, tranquila y aliviada, como si hubiera querido que alguien le dijera que no tenía que cargar con eso—. Solo quería decirlo en voz alta para que todas pudiéramos avergonzarnos de ello.</w:t>
       </w:r>
     </w:p>
     <w:p>
@@ -1962,7 +1962,7 @@
     <w:p/>
     <w:p>
       <w:r>
-        <w:t xml:space="preserve">—No lo hice yo. Le di la vuelta a un dibujo —lo dijo rotundamente, rechazando el mérito, y comprendí que el rechazo formaba parte de la expiación. Una regla que se había impuesto contra las muestras de agradecimiento, y pensaba cumplir por mucho que le pesara—. Quienquiera que presionara ese dibujo en su marco con las palabras de la fundadora ocultas dentro, lo hizo él. Solo dio la casualidad de que yo estaba ordenando la caja el día que necesitaba que le dieran la vuelta.</w:t>
+        <w:t xml:space="preserve">—No lo hice yo. Le di la vuelta a un dibujo. —Lo dijo rotundamente, rechazando el mérito, y comprendí que el rechazo formaba parte de la expiación. Una regla que se había impuesto contra las muestras de agradecimiento, y pensaba cumplir por mucho que le pesara—. Quienquiera que presionara ese dibujo en su marco con las palabras de la fundadora ocultas dentro, lo hizo él. Solo dio la casualidad de que yo estaba ordenando la caja el día que necesitaba que le dieran la vuelta.</w:t>
       </w:r>
     </w:p>
     <w:p/>
@@ -2276,7 +2276,7 @@
     <w:p/>
     <w:p>
       <w:r>
-        <w:t xml:space="preserve">Caminé a casa despacio, con la aguja envuelta pesando bajo mi brazo. Pip se mantuvo pegada a mi rodilla con el pico levantado hacia él, por si el papel de carnicero resultaba al final contener un pez. No lograba encajar a Pete Garcia en ninguna parte de mi mente, ni de un lado ni del otro.</w:t>
+        <w:t xml:space="preserve">Caminé a casa despacio, con la aguja envuelta pesando bajo mi brazo. Pip se mantuvo pegada a mi rodilla con el pico levantado hacia ella, por si el papel de carnicero resultaba al final contener un pez. No lograba encajar a Pete Garcia en ninguna parte de mi mente, ni de un lado ni del otro.</w:t>
       </w:r>
     </w:p>
     <w:p/>
@@ -2475,7 +2475,7 @@
     </w:p>
     <w:p>
       <w:r>
-        <w:t xml:space="preserve">—Este es el hogar que le estoy construyendo, para que deje de tomar prestados los muñecos de nieve. —Una sonrisa cansada y sincera—. No está listo. Faltan años para que esté del todo. Pero es un principio, y hasta que esté terminado, seguirá volviendo una vela dorada y haciendo caminar a los muñecos de nieve de los niños en la oscuridad, porque quiere estar aquí y no tiene piernas propias. Bram está fuera de sí. Piensa que es indigno, que la magia se meta en travesuras públicas donde el pueblo puede verla. La encerraría en el prado con los renos si pudiera, y con tantas probabilidades de retenerla.</w:t>
+        <w:t xml:space="preserve">—Este es el hogar que le estoy construyendo, para que deje de tomar prestados los muñecos de nieve. —Una sonrisa cansada y sincera—. No está listo. Faltan años para que esté del todo. Pero es un principio, y hasta que esté terminado, seguirá volviendo dorada una vela y haciendo caminar a los muñecos de nieve de los niños en la oscuridad, porque quiere estar aquí y no tiene piernas propias. Bram está fuera de sí. Piensa que es indigno, que la magia se meta en travesuras públicas donde el pueblo puede verla. La encerraría en el prado con los renos si pudiera, y con tantas probabilidades de retenerla.</w:t>
       </w:r>
     </w:p>
     <w:p>
@@ -3536,7 +3536,7 @@
     <w:p/>
     <w:p>
       <w:r>
-        <w:t xml:space="preserve">—No le entretendré con su trabajo —dije—. He venido a decirle que le tenía fichado. Lo de los problemas de Greta. Por el simple hecho de que está usted en ese patio antes de que amanezca y nadie más tiene el derecho de estarlo. —Había descubierto que lo mejor era entregarle a un hombre el asunto feo por entero y dejar que lo mirara—. Y he venido a decirle que le he tachado de la lista. Lo que haya hecho esto requería un temple para la oscuridad y un oficio de panadero para el polvo, y usted no tiene ninguna de las dos cosas. Discute a mediodía y corta carne. No le pega.</w:t>
+        <w:t xml:space="preserve">—No quiero apartarle de su trabajo —dije—. He venido a decirle que le tenía fichado. Lo de los problemas de Greta. Por el simple hecho de que está usted en ese patio antes de que amanezca y nadie más tiene el derecho de estarlo. —Había descubierto que lo mejor era entregarle a un hombre el asunto feo por entero y dejar que lo mirara—. Y he venido a decirle que le he tachado de la lista. Lo que haya hecho esto requería un temple para la oscuridad y un oficio de panadero para el polvo, y usted no tiene ninguna de las dos cosas. Discute a mediodía y corta carne. No le pega.</w:t>
       </w:r>
     </w:p>
     <w:p/>
@@ -4615,7 +4615,7 @@
     <w:p/>
     <w:p>
       <w:r>
-        <w:t xml:space="preserve">—Han parado —dijo, antes de que pudiera preguntar—. Las miradas. Lo que le dijo usted a la señora Bennett corrió de boca en boca. Cierta señora de la escuela le soltó a mi madre sin rodeos que no pude ser yo. —Miró los caramelos de miel en vez de a mí—. Así que. Gracias. Sé que fue usted.</w:t>
+        <w:t xml:space="preserve">—Han parado —dijo, antes de que pudiera preguntar—. Las miradas. Lo que le dijo usted a la señora Bennett corrió de boca en boca. Cierta señora de la escuela le soltó a mi madre sin rodeos que no podía haber sido yo. —Miró los caramelos de miel en vez de a mí—. Así que. Gracias. Sé que fue usted.</w:t>
       </w:r>
     </w:p>
     <w:p/>
@@ -4675,7 +4675,7 @@
     <w:p/>
     <w:p>
       <w:r>
-        <w:t xml:space="preserve">—Hubo una mañana en que vi a alguien en la parte trasera de la panadería de Greta. Muy oscuro, antes de que sus hornos se pusieran en marcha, sin luz en su ventana todavía. Alguien adulto, con delantal de panadera. No Greta. Greta es ancha, y esta persona era delgada. Rápida y pulcra, no como alguien que empieza un turno. Un delantal largo, de esos que llegan hasta las espinillas, pálido, con un abrigo debajo. Se quedó un minuto en su escalón trasero, y luego subió por el callejón hacia el extremo lejano. No entró en ninguna parte. La perdí de vista pasado el foco de la farmacia. —Frunció el ceño—. Supuse que era un reparto.</w:t>
+        <w:t xml:space="preserve">—Hubo una mañana en que vi a alguien en la parte trasera de la panadería de Greta. Muy oscuro, antes de que sus hornos se pusieran en marcha, sin luz en su ventana todavía. Alguien adulto, con delantal de panadero. No Greta. Greta es ancha, y esta persona era delgada. Rápida y pulcra, no como alguien que empieza un turno. Un delantal largo, de esos que llegan hasta las espinillas, pálido, con un abrigo debajo. Se quedó un minuto en su escalón trasero, y luego subió por el callejón hacia el extremo lejano. No entró en ninguna parte. La perdí de vista pasado el foco de la farmacia. —Frunció el ceño—. Supuse que era un reparto.</w:t>
       </w:r>
     </w:p>
     <w:p/>
@@ -4792,7 +4792,7 @@
     <w:p/>
     <w:p>
       <w:r>
-        <w:t>—No. No tiene.</w:t>
+        <w:t xml:space="preserve">—No. No tiene por qué.</w:t>
       </w:r>
     </w:p>
     <w:p/>
@@ -5044,7 +5044,7 @@
     <w:p/>
     <w:p>
       <w:r>
-        <w:t xml:space="preserve">Me había sentado en aquel banco con Danny Ott pensando que la gente juzgaba demasiado deprisa. Los había visto hacerle lo mismo a Pete por culpa de la cadena de una verja, y a los Doucette por una factura de calefacción. Yo había hecho exactamente lo mismo con Renée Duval, solo que en silencio, donde nadie pudiera decir que me equivocaba. El doctor habría podido. Lo había llevado porque estaba segurísima de que no podría.</w:t>
+        <w:t xml:space="preserve">Me había sentado en aquel banco con Danny Ott pensando que la gente juzgaba demasiado deprisa. Los había visto hacerle lo mismo a Pete por culpa de la cadena de una verja, y a los Doucette por una factura de calefacción. Yo había hecho exactamente lo mismo con Renée Duval, solo que en silencio, donde nadie pudiera decir que me equivocaba. El doctor habría podido. Lo había llevado porque estaba segurísima de que no lo haría.</w:t>
       </w:r>
     </w:p>
     <w:p/>
@@ -5062,7 +5062,7 @@
     <w:p/>
     <w:p>
       <w:r>
-        <w:t xml:space="preserve">Al llegar a casa, la corona reposaba sobre la mesa tal como la había dejado. Me senté frente a ella con el abrigo puesto, desaté el alambre y fui levantando el abeto del aro, ramita a ramita, hasta que no quedó ante mí más que la estructura de acero desnuda. Pip atrapó el extremo suelto de la cinta dorada con el pico y se escabulló debajo de la mesa, y yo se la dejé. Luego tomé la primera ramita de la pila y lo apoyé contra el aro.</w:t>
+        <w:t xml:space="preserve">Al llegar a casa, la corona reposaba sobre la mesa tal como la había dejado. Me senté frente a ella con el abrigo puesto, desaté el alambre y fui levantando el abeto del aro, ramita a ramita, hasta que no quedó ante mí más que la estructura de acero desnuda. Pip atrapó el extremo suelto de la cinta dorada con el pico y se escabulló debajo de la mesa, y yo se la dejé. Luego tomé la primera ramita de la pila y la apoyé contra el aro.</w:t>
       </w:r>
     </w:p>
     <w:p>
@@ -5123,7 +5123,7 @@
     </w:p>
     <w:p>
       <w:r>
-        <w:t xml:space="preserve">No me quedé todo el día. Estaba Greta de por medio y una corona que entregar en otra parte. Y cargué con el día de ayer a lo largo de todo ello, no podía no cargarlo: las reservas de Renée abiertas para Doc estante por estante sin un ápice de base agria entre ellas, mi certeza desvanecida bajo mis pies y el recuerdo de cuánto había deseado que fuera ella. Dos clases de problemas en una sola calle. Una caldera agrietada, que no era culpa de nadie. Un cubo de harina adulterado y una denuncia mecanografiada, que eran de alguien, y yo ya no sabía de quién. Me fui a casa con ambos asuntos rondándome la cabeza.</w:t>
+        <w:t xml:space="preserve">No me quedé todo el día. Tenía que ocuparme de Greta y entregar una corona en otra parte. Y cargué con el día de ayer a lo largo de todo ello, no podía no cargarlo: las reservas de Renée abiertas para Doc estante por estante sin un ápice de base agria entre ellas, mi certeza desvanecida bajo mis pies y el recuerdo de cuánto había deseado que fuera ella. Dos clases de problemas en una sola calle. Una caldera agrietada, que no era culpa de nadie. Un cubo de harina adulterado y una denuncia mecanografiada, que eran de alguien, y yo ya no sabía de quién. Me fui a casa con ambos asuntos rondándome la cabeza.</w:t>
       </w:r>
     </w:p>
     <w:p>
@@ -5402,7 +5402,7 @@
     </w:p>
     <w:p>
       <w:r>
-        <w:t xml:space="preserve">—No le di ninguna. Un conductor que se detiene a echar una cabezada. Pero Pete conoce cada camión que entra en ese patio, y dijo que no era el del proveedor de carne, y yo no oí el de nadie más. —Deslicé el dedo por la cuchara hacia el pimentero—. Y la silueta de Danny. Delgada y rápida, ante el umbral de Greta antes de que se encendieran los hornos, y marchándose hacia el extremo más alejado. Mencionó la tienda dorada. Nunca dijo que se metiera en </w:t>
+        <w:t xml:space="preserve">—No le di ninguna. Un conductor que se detiene a echar una cabezada. Pero Pete conoce cada camión que entra en ese patio, y dijo que no era el del proveedor de carne, y yo entendí que no era de nadie. —Deslicé el dedo por la cuchara hacia el pimentero—. Y la silueta de Danny. Delgada y rápida, ante el umbral de Greta antes de que se encendieran los hornos, y marchándose hacia el extremo más alejado. Yo entendí que era la tienda dorada. Nunca dijo que se metiera en </w:t>
       </w:r>
       <w:r>
         <w:t xml:space="preserve"/>
@@ -5509,7 +5509,7 @@
     </w:p>
     <w:p>
       <w:r>
-        <w:t xml:space="preserve">—Eso es lo que creí. Luego Doc revisó su despensa el jueves y no había ninguna base agria allí, y ella me dijo quién le había estado hablando sobre la lechada de Greta. —No fui más allá, habiendo renunciado a los rostros por esa noche—. Así que me quedo con el papel. Un folleto sirve de prueba en el mostrador de alguien mucho antes de ser un folleto en un tablón. Alguien lo vio allí. Alguien leyó esa semana en él y redactó una denuncia para el condado que cayera justo en esas fechas.</w:t>
+        <w:t xml:space="preserve">—Eso es lo que creí. Luego Doc revisó su despensa el jueves y no había ninguna base agria allí, y ella me dijo quién le había estado hablando sobre la lechada de Greta. —No fui más allá, habiendo renunciado a los rostros por esa noche—. Así que me quedo con el papel. Un folleto es una prueba de imprenta en el mostrador de alguien mucho antes de ser un folleto en un tablón. Alguien lo vio allí. Alguien leyó esa semana en él y redactó una denuncia para el condado que cayera justo en esas fechas.</w:t>
       </w:r>
     </w:p>
     <w:p>
@@ -6532,7 +6532,7 @@
     </w:p>
     <w:p>
       <w:r>
-        <w:t xml:space="preserve">Pip se despertó con el ruido del grifo y cruzó el suelo para plantarse junto a mi silla, mirando hacia arriba, hasta que le puse un platillo con eperlanos. Se las comió una a una, con gran ceremonia, mientras Nick rompía los huevos y yo doblaba la página de Claire para guardarla en el abrigo.</w:t>
+        <w:t xml:space="preserve">Pip se despertó con el ruido del grifo y cruzó el suelo para plantarse junto a mi silla, mirando hacia arriba, hasta que le puse un platillo con eperlanos. Se los comió uno a uno, con gran ceremonia, mientras Nick rompía los huevos y yo doblaba la página de Claire para guardarla en el abrigo.</w:t>
       </w:r>
     </w:p>
     <w:p>
@@ -6833,7 +6833,7 @@
     <w:p/>
     <w:p>
       <w:r>
-        <w:t xml:space="preserve">La jefa Tanaka había preparado la sala ella misma, no la oficina principal con su mostrador, sino la habitación silenciosa que había detrás, con una mesa sencilla y buenas sillas. Habían llevado la tetera abollada y lo habían puesto a calentar en un rincón, por lo que el aire tenía vapor. Tanaka se sentó a la cabecera con su cuaderno gastado bien alineado frente a ella y una carpeta marrón debajo. Greta se sentaba a mi lado, muy erguida con su buen abrigo. Había venido a mirar a Joyce, y la estaba mirando. Pip se quedó junto a mi bota debajo de la mesa, porque no había pedido permiso para traer al ave y a nadie se le había ocurrido negárselo.</w:t>
+        <w:t xml:space="preserve">La jefa Tanaka había preparado la sala ella misma, no la oficina principal con su mostrador, sino la habitación silenciosa que había detrás, con una mesa sencilla y buenas sillas. Habían llevado la tetera abollada y la habían puesto a calentar en un rincón, por lo que el aire tenía vapor. Tanaka se sentó a la cabecera con su cuaderno gastado bien alineado frente a ella y una carpeta marrón debajo. Greta se sentaba a mi lado, muy erguida con su buen abrigo. Había venido a mirar a Joyce, y la estaba mirando. Pip se quedó junto a mi bota debajo de la mesa, porque no había pedido permiso para traer al ave y a nadie se le había ocurrido negárselo.</w:t>
       </w:r>
     </w:p>
     <w:p/>
@@ -6917,7 +6917,7 @@
     <w:p/>
     <w:p>
       <w:r>
-        <w:t>—Le estaba respondiendo a mi repartidor. —Joyce le dirigió a Greta una sonrisa irónica—. Y llamamos a todos los clientes de panadería que encontramos, cariño. Se llama vender. Siento si escoció.</w:t>
+        <w:t xml:space="preserve">—Le estaba respondiendo a mi repartidor. —Joyce le dirigió a Greta una sonrisa contrita—. Y llamamos a todos los clientes de panadería que encontramos, cariño. Se llama vender. Siento si escoció.</w:t>
       </w:r>
     </w:p>
     <w:p/>
@@ -7001,7 +7001,7 @@
     <w:p/>
     <w:p>
       <w:r>
-        <w:t>—Veinticinco años —le dijo a Greta—. Nunca la cambiaste. Dios, Gret.</w:t>
+        <w:t xml:space="preserve">—Veinticinco años —le dijo a Greta—. Nunca lo cambiaste. Dios, Gret.</w:t>
       </w:r>
     </w:p>
     <w:p/>
@@ -7091,7 +7091,7 @@
     <w:p/>
     <w:p>
       <w:r>
-        <w:t xml:space="preserve">—Pero no lo hiciste por la tarta —dijo Greta—. No me digas que lo hiciste por eso. Llamaste a Martha. Le habrías arrebatado mi Acción de Gracias de mi propio mostrador, todos los nombres de ese libro. Metiste un ladrillo por mi ventana que salió de la basura de esa chica francesa, para que yo mirara calle arriba y la culpase a ella. —Se le movió la boca—. Me mandó a una chica con financiers, Joyce. Esa no me traga, y me mandó a una chica con financiers. Y tú entraste con una escoba.</w:t>
+        <w:t xml:space="preserve">—Pero no lo hiciste por la tarta —dijo Greta—. No me digas que lo hiciste por eso. Llamaste a Martha. Te habrías llevado mi Acción de Gracias de mi propio mostrador, todos los nombres de ese libro. Metiste un ladrillo por mi ventana que salió de la basura de esa chica francesa, para que yo mirara calle arriba y la culpase a ella. —Se le movió la boca—. Me mandó a una chica con financiers, Joyce. Esa no me traga, y me mandó a una chica con financiers. Y tú entraste con una escoba.</w:t>
       </w:r>
     </w:p>
     <w:p/>
@@ -7169,7 +7169,7 @@
     <w:p/>
     <w:p>
       <w:r>
-        <w:t xml:space="preserve">—Ahora querrá un abogado, señora Wendt —dijo, no sin amabilidad—. Está en su derecho, y yo lo haría en su lugar. Pero seré clara al respecto para que nadie se confunda más tarde. Lo que tengo es el registro de un proveedor con su firma, la coincidencia de un químico, un registro estatal, un hombre que conoce su furgoneta y dos mujeres a las que su panadería llamó con pedidos sacados de un libro que no tenía derecho a leer. Todo por escrito. Nada de eso requiere que usted admita nada. —Dejó el bolígrafo sobre la mesa—. De lo que sea que se arrepienta esta tarde, y creo que hay algo, no cambia ni una sola palabra de lo escrito. Hoy mismo se le imputarán cargos. Llame a su abogado, vuelva con él antes de las seis y haremos el resto sin hacer ruido.</w:t>
+        <w:t xml:space="preserve">—Ahora querrá un abogado, señora Wendt —dijo, no sin amabilidad—. Está en su derecho, y yo lo haría en su lugar. Pero seré clara al respecto para que nadie se confunda más tarde. Lo que tengo es el registro de un proveedor con su firma, la coincidencia de un químico, un registro estatal, un hombre que conoce su furgoneta y dos mujeres a las que su panadería llamó con pedidos sacados de un libro que no tenía derecho a leer. Todo por escrito. Nada de eso requiere que usted admita nada. —Dejó el bolígrafo sobre la mesa—. Se arrepienta de lo que se arrepienta esta tarde, y creo que hay algo, eso no cambia ni una sola palabra de lo escrito. Hoy mismo se le imputarán cargos. Llame a su abogado, vuelva con él antes de las seis y haremos el resto sin hacer ruido.</w:t>
       </w:r>
     </w:p>
     <w:p/>
@@ -7249,7 +7249,7 @@
     <w:p/>
     <w:p>
       <w:r>
-        <w:t xml:space="preserve">Se había hecho con discreción, tal como había prometido. Sin salones. Sin aglomeración. Ella misma había sacado mi tarro de harina del armario con llave de Doc, con su nota firmada al lado, y había llevado a Danny a un lado con delicadeza, apuntando cada paso a medida que avanzaba.</w:t>
+        <w:t xml:space="preserve">Se había hecho con discreción, tal como había prometido. Sin salones. Sin aglomeración. Ella misma había sacado mi tarro de harina del armario con llave de Doc, con su nota firmada al lado, y le había tomado declaración a Danny aparte, con delicadeza, apuntando cada paso a medida que avanzaba.</w:t>
       </w:r>
     </w:p>
     <w:p/>
@@ -7375,7 +7375,7 @@
     <w:p/>
     <w:p>
       <w:r>
-        <w:t>La ayudante me dejó pasar. Renée salió de la parte trasera secándose las manos con un paño blanco, y esta vez no iluminó su rostro para mí.</w:t>
+        <w:t xml:space="preserve">La ayudante me dejó pasar. Renée salió de la parte trasera secándose las manos con un paño blanco, y esta vez no se le iluminó la cara al verme.</w:t>
       </w:r>
     </w:p>
     <w:p/>
@@ -7536,7 +7536,7 @@
     <w:p/>
     <w:p>
       <w:r>
-        <w:t xml:space="preserve">Llegó de la misma manera sencilla, con el maletín de cuero plano bajo el brazo y el mismo abrigo del condado. Pero al llegar a la puerta del Holly Jolly llevaba un brío que no tenía la primera vez, el de un hombre alegre por una vez de haber sido mandado. Tanaka le había llevado el tarro y la falsa denuncia al condado, y los administrativos de allí vieron qué hábil mano había hecho uso de sus documentos y los desataron nudo a nudo. La suspensión provisional quedó sin efecto. De todas formas, tenía que volver esa semana para su reinspección. La pieza para el lavamanos había llegado esa mañana, y Tom la había instalado antes de que él llegara. Las tres juntas gastadas de la cocina de Greta eran las mismas que tenía cualquier cocina antigua de la avenida, y ya no eran nada. Varney se plantó en el umbral de su puerta y se lo dijo, en voz alta, con la tienda medio llena de gente que había venido a escucharlo.</w:t>
+        <w:t xml:space="preserve">Llegó de la misma manera sencilla, con el maletín de cuero plano bajo el brazo y el mismo abrigo del condado. Pero al llegar a la puerta del Holly Jolly llevaba un brío que no tenía la primera vez, el de un hombre alegre por una vez de haber sido mandado. Tanaka había llevado el tarro y la falsa denuncia al condado, y los administrativos de allí vieron qué hábil mano había hecho uso de sus documentos y los desataron nudo a nudo. La suspensión provisional quedó sin efecto. De todas formas, tenía que volver esa semana para su reinspección. La pieza para el lavamanos había llegado esa mañana, y Tom la había instalado antes de que él llegara. Las tres juntas gastadas de la cocina de Greta eran las mismas que tenía cualquier cocina antigua de la avenida, y ya no eran nada. Varney se plantó en el umbral de su puerta y se lo dijo, en voz alta, con la tienda medio llena de gente que había venido a escucharlo.</w:t>
       </w:r>
     </w:p>
     <w:p/>
@@ -7560,7 +7560,7 @@
     <w:p/>
     <w:p>
       <w:r>
-        <w:t xml:space="preserve">Greta miró el papel durante un largo rato, con las manos cruzadas. El último del condado había sido amarillo. Luego metió la mano bajo su mostrador, le cortó la esquina a una tarta de chocolate y pacana, y se la puso en la mano. No había nada que perdonarle a él. Él era solo el hombre al que habían enviado. Se lo comió de pie en el umbral con el frío a sus espaldas, hasta la última miga, antes de irse.</w:t>
+        <w:t xml:space="preserve">Greta miró el papel durante un largo rato, con las manos cruzadas. El último del condado había sido amarillo. Luego metió la mano bajo su mostrador, le cortó la esquina a una tarta de chocolate y pacana, y se la puso en la mano. No había nada que perdonarle a él. Él era solo el hombre al que habían enviado. Se la comió de pie en el umbral con el frío a sus espaldas, hasta la última miga, antes de irse.</w:t>
       </w:r>
     </w:p>
     <w:p/>
@@ -7788,7 +7788,7 @@
     <w:p/>
     <w:p>
       <w:r>
-        <w:t>Eso fue todo. Le había dicho el resto al otro lado de la mesa de la jefa, y no necesitaba volvérselo a decir a mí.</w:t>
+        <w:t xml:space="preserve">Eso fue todo. Le había dicho el resto a Joyce al otro lado de la mesa de la jefa, y no necesitaba volvérselo a decir a mí.</w:t>
       </w:r>
     </w:p>
     <w:p/>

</xml_diff>

<commit_message>
Full proofcheck Flour Play Spanish: MINOR (39 edits)
Co-Authored-By: Claude Opus 5.5 <noreply@anthropic.com>
Claude-Session: https://claude.ai/code/session_012Cm8JxdqzjuttdUSdkQCUg
</commit_message>
<xml_diff>
--- a/translated/corrected/Flour Play - ASSEMBLED - FORMATTED_Spanish.docx
+++ b/translated/corrected/Flour Play - ASSEMBLED - FORMATTED_Spanish.docx
@@ -667,7 +667,7 @@
     </w:p>
     <w:p>
       <w:r>
-        <w:t>Me quedé otra hora. Hice que Greta se tomara una taza de té y me tomé otra con ella. La ayudé a llevar los panes arruinados al contenedor del callejón, brazada tras brazada, toda una tanda de su buen trabajo yéndose al frío. En el último viaje hacia dentro, metí una taza de la harina mala de la superficie del cubo en el tarro de conservas vacío que había pensado devolverle, enrosqué la tapa y la metí en mi abrigo, porque Pip no quiso acercarse a esa harina.</w:t>
+        <w:t>Me quedé otra hora. Hice que Greta se tomara una taza de té y me tomé otra con ella. La ayudé a llevar los panes arruinados al contenedor del callejón, brazada tras brazada, toda una tanda de su buen trabajo yéndose al frío. En el último viaje hacia dentro, metí una taza de la harina mala de la superficie del cubo en el tarro de conservas vacío que había pensado devolverle, enrosqué la tapa y lo metí en el abrigo, porque Pip no quiso acercarse a esa harina.</w:t>
       </w:r>
     </w:p>
     <w:p>
@@ -888,7 +888,7 @@
     <w:p/>
     <w:p>
       <w:r>
-        <w:t>A pesar de todo, no conseguía estar cómoda. Bajo su calidez, era fría y precisa. Me había dado la bienvenida y me había invitado a comer, y al mismo tiempo, sin que yo se lo pidiera, había sembrado una duda pequeña y sutil sobre la única panadera de la avenida cuyo año entero dependía de las próximas seis semanas. Lo había hecho con tanta suavidad, con tanta compasión, que cualquiera que no estuviera prestando atención le habría agradecido su preocupación.</w:t>
+        <w:t>A pesar de todo, no conseguía estar cómoda. Bajo su calidez, era fría y precisa. Me había dado la bienvenida y me había dado de comer, y al mismo tiempo, sin que yo se lo pidiera, había sembrado una duda pequeña y sutil sobre la única panadera de la avenida cuyo año entero dependía de las próximas seis semanas. Lo había hecho con tanta suavidad, con tanta compasión, que cualquiera que no estuviera prestando atención le habría agradecido su preocupación.</w:t>
       </w:r>
     </w:p>
     <w:p/>
@@ -1172,7 +1172,7 @@
     <w:p/>
     <w:p>
       <w:r>
-        <w:t>Un escaparate roto era un gasto, y se podía arreglar. Greta volvería a tener cristales para finales de semana. Pero quienquiera que hubiese entrado por la noche no se había detenido ante el cristal: había escrito, para que cualquiera que pasara por la avenida lo leyera, que su comida era asquerosa y su tienda un peligro. Y una panadería, tal como Renée me había dicho dos días antes en la acera frente a su nuevo establecimiento, vive de su nombre.</w:t>
+        <w:t>Un escaparate roto era un gasto, y se podía arreglar. Greta volvería a tener cristales para finales de semana. Pero quienquiera que hubiese venido por la noche no se había detenido ante el cristal: había escrito, para que cualquiera que pasara por la avenida lo leyera, que su comida era asquerosa y su tienda un peligro. Y una panadería, tal como Renée me había dicho dos días antes en la acera frente a su nuevo establecimiento, vive de su nombre.</w:t>
       </w:r>
     </w:p>
     <w:p/>
@@ -1494,7 +1494,7 @@
     </w:p>
     <w:p>
       <w:r>
-        <w:t>Lo supe en cuanto entré haciendo ruido con las botas. Las seis estaban inclinadas sobre sus bastidores como antes, con el abeto balsámico y el mismo tarro de piñas doradas, pero la tienda se había quedado en silencio de otra manera. Era la calma chicha de unas mujeres que venían de hablar de cosas serias y que iban a seguir haciéndolo en cuanto la puerta dejara de moverse. Olivia levantó la vista desde su silla en la cabecera del círculo. —Siéntate, Jessica. A todas nos revuelve el estómago.</w:t>
+        <w:t>Lo supe en cuanto entré haciendo ruido con las botas. Las seis estaban inclinadas sobre sus armazones como antes, con el abeto balsámico y el mismo tarro de piñas doradas, pero la tienda se había quedado en silencio de otra manera. Era la calma chicha de unas mujeres que venían de hablar de cosas serias y que iban a seguir haciéndolo en cuanto la puerta dejara de moverse. Olivia levantó la vista desde su silla en la cabecera del círculo. —Siéntate, Jessica. A todas nos revuelve el estómago.</w:t>
       </w:r>
     </w:p>
     <w:p>
@@ -1504,7 +1504,7 @@
     </w:p>
     <w:p>
       <w:r>
-        <w:t xml:space="preserve">Me senté en la silla que me habían guardado, en el centro cálido del círculo en vez de en el extremo frío junto a la puerta. Olivia me puso un bastidor nuevo en el regazo y un puñado de abeto balsámico al lado sin que se lo pidiera. Me puse a colocar las ramitas, una sobre otra, todas apuntando hacia casa, y escuché.</w:t>
+        <w:t xml:space="preserve">Me senté en la silla que me habían guardado, en el centro cálido del círculo en vez de en el extremo frío junto a la puerta. Olivia me puso un armazón nuevo en el regazo y un puñado de abeto balsámico al lado sin que se lo pidiera. Me puse a colocar las ramitas, una sobre otra, todas apuntando hacia casa, y escuché.</w:t>
       </w:r>
     </w:p>
     <w:p>
@@ -1609,7 +1609,7 @@
     </w:p>
     <w:p>
       <w:r>
-        <w:t>—Lo bloqueó con una cadena en julio para que no pudiera entrar la harina de ella —dijo Dot—. Ella llamó al ayuntamiento para denunciarlo. Él les devolvió la llamada hablando de ratas en los contenedores de ella. —Dio un tijeretazo a un alambre—. Algo asqueroso que decir de una panadera. Y él lo sabía. Además, Tom dice que Pete se ha estado pasando por ese callejón a todas horas últimamente. Antes de que amanezca. Después de cerrar.</w:t>
+        <w:t>—Lo bloqueó con una cadena en julio para que no pudiera entrar la harina de ella —dijo Dot—. Ella llamó al ayuntamiento para denunciarlo. Él, a su vez, los llamó por lo de las ratas en los contenedores de ella. —Dio un tijeretazo a un alambre—. Algo asqueroso que decir de una panadera. Y él lo sabía. Además, Tom dice que Pete se ha estado pasando por ese callejón a todas horas últimamente. Antes de que amanezca. Después de cerrar.</w:t>
       </w:r>
     </w:p>
     <w:p>
@@ -1806,7 +1806,7 @@
     <w:p/>
     <w:p>
       <w:r>
-        <w:t xml:space="preserve">—Señora Claus. —Dejó el destornillador bien alineado sobre el paño y se frotó las manos, aunque estaban limpias—. No oí la campanilla. La jefa Tanaka dice que debo mantenerlo funcionando para que la gente sepa cuando alguien ha venido, y se me olvida estar atento. —Hizo una mueca de pesar con la boca—. Me olvido de una gran cantidad de las pequeñas reglas. Las estoy aprendiendo.</w:t>
+        <w:t xml:space="preserve">—Señora Claus. —Dejó el destornillador bien alineado sobre el paño y se secó las manos, aunque estaban limpias—. No oí la campanilla. La jefa Tanaka dice que debo mantenerla funcionando para que la gente sepa cuando alguien ha venido, y se me olvida estar atento. —Hizo una mueca de pesar con la boca—. Me olvido de una gran cantidad de las pequeñas reglas. Las estoy aprendiendo.</w:t>
       </w:r>
     </w:p>
     <w:p/>
@@ -2338,7 +2338,7 @@
     </w:p>
     <w:p>
       <w:r>
-        <w:t>Y así era, en efecto. No había otra palabra honesta. Me quedé en lo alto de la avenida Evergreen con Pip a mi lado, ante una multitud cada vez más efervescente que llenaba toda la manzana. Y hasta yo, que conocía la mano que había hecho aquello tan bien como la mía, me quedé sin aliento ante su pura y alegre insensatez.</w:t>
+        <w:t>Y así era, en efecto. No había otra palabra honesta. Me quedé en lo alto de la avenida Evergreen con Pip a mi lado, ante una multitud cada vez más numerosa que llenaba toda la manzana. Y hasta yo, que conocía la mano que había hecho aquello tan bien como la mía, me quedé sin aliento ante su pura y alegre insensatez.</w:t>
       </w:r>
     </w:p>
     <w:p>
@@ -2517,7 +2517,7 @@
     </w:p>
     <w:p>
       <w:r>
-        <w:t xml:space="preserve">Me giré para volver a casa en la oscuridad que se cerraba, con todo el pueblo cálido a mis espaldas, un frío muñeco de nieve inclinado hacia el otro lado, y la magia a mi alrededor llena de una ternura tan urgente y sin palabras que ella no podía deletrear y yo aún no podía deletrear por ella. A media manzana Pip se detuvo y miró hacia atrás al muñeco de nieve, para luego apresurarse a alcanzarme.</w:t>
+        <w:t xml:space="preserve">Me giré para volver a casa en la oscuridad que se cerraba, con todo el pueblo cálido a mis espaldas, un frío muñeco de nieve inclinado hacia el otro lado, y la magia a mi alrededor llena de una ternura urgente y sin palabras que ella no podía deletrear y yo aún no podía deletrear por ella. A media manzana Pip se detuvo y miró hacia atrás al muñeco de nieve, para luego apresurarse a alcanzarme.</w:t>
       </w:r>
     </w:p>
     <w:p>
@@ -2537,7 +2537,7 @@
         <w:t xml:space="preserve">PANADERÍA HOLLY JOLLY</w:t>
       </w:r>
       <w:r>
-        <w:t xml:space="preserve"> cruzando de nuevo toda la fachada gracias a Tom, el de la ferretería. Abrió sus puertas esa misma mañana con una avalancha de clientela que casi la hizo llorar. Sus hornos habían vuelto a funcionar tan bien como extrañamente habían dejado de hacerlo. Desde lo del ladrillo, había mantenido la puerta trasera cerrada con cerrojo mientras horneaba, con cocina calurosa o sin ella, y cada hornada posterior había salido perfecta. Estaba de pie tras su mostrador reparado, espolvoreada de harina e iluminada como una lámpara, vendiendo galletas de jengibre a una cola que salía por la puerta y diciéndole a todo el mundo en voz alta que jamás había dudado de la temporada ni por un minuto. Era una mentira. Una mentira entrañable, y todos en la calle se la consintieron.</w:t>
+        <w:t xml:space="preserve"> cruzando de nuevo toda la fachada gracias a Tom, el de la ferretería. Abrió sus puertas esa misma mañana con una avalancha de clientela que casi la hizo llorar. Sus hornos se habían arreglado de forma tan extraña como se habían estropeado. Desde lo del ladrillo, había mantenido la puerta trasera cerrada con cerrojo mientras horneaba, con cocina calurosa o sin ella, y cada hornada posterior había salido perfecta. Estaba de pie tras su mostrador reparado, espolvoreada de harina e iluminada como una lámpara, vendiendo galletas de jengibre a una cola que salía por la puerta y diciéndole a todo el mundo en voz alta que jamás había dudado de la temporada ni por un minuto. Era una mentira. Una mentira entrañable, y todos en la calle se la consintieron.</w:t>
       </w:r>
     </w:p>
     <w:p/>
@@ -2982,7 +2982,7 @@
     <w:p/>
     <w:p>
       <w:r>
-        <w:t xml:space="preserve">—Ya sabe lo que dicen. —Lo dijo sin acidez, agotada más allá de la acidez—. Hay una tienda con el escaparate roto al final de la avenida y una familia con retraso en el gasóleo colina arriba, y la gente tiene aritmética en la cabeza, señora Claus, incluso los amables. Lo he sentido en la tienda. Una pausa antes del buenos días. Un ojo que va a mi cesta y hace cuentas. —Su boca se torció, sin llegar a ser amarga—. Como si un hombre que no puede pagar el gasóleo fuera a tomarse una noche y un bote de pintura para ir a asustar a la única mujer de esta calle que ha puesto una hogaza gratis en más manos que nadie. Como si ahí es donde un hombre hambriento gastara sus fuerzas. —Dejó la taza—. Marc casi bajó allí a decírselo a la calle. Lo detuve. No aclaras nada gritando. Solo les das de qué hablar con tus gritos.</w:t>
+        <w:t xml:space="preserve">—Ya sabe lo que dicen. —Lo dijo sin acidez, agotada más allá de la acidez—. Hay una tienda con el escaparate roto al final de la avenida y una familia con retraso en el gasóleo colina arriba, y la gente tiene aritmética en la cabeza, señora Claus, incluso los amables. Lo he sentido en la tienda. Una pausa antes del buenos días. Un ojo que va a mi cesta y hace cuentas. —Su boca se torció, sin llegar a ser amarga—. Como si un hombre que no puede pagar el gasóleo fuera a tomarse una noche y un bote de pintura para ir a asustar a la única mujer de esta calle que ha puesto una hogaza gratis en más manos que nadie. Como si fuera ahí donde un hombre hambriento gastara sus fuerzas. —Dejó la taza—. Marc casi bajó allí a decírselo a la calle. Lo detuve. No aclaras nada gritando. Solo les das de qué hablar con tus gritos.</w:t>
       </w:r>
     </w:p>
     <w:p/>
@@ -3227,7 +3227,7 @@
     </w:p>
     <w:p>
       <w:r>
-        <w:t>Me quedé de pie y miré hacia donde ella miraba, hacia las oscuras fachadas traseras de las tiendas, los escalones cubiertos de ventisqueros y las puertas cerradas. La magia no podía decirme un nombre. Nunca podía. Tenía más corazón que ingenio, decía mi Nick, y no sabía deletrear. Llevaba dos días de pie frente a aquel callejón, y ahora se inclinaba hacia la parte trasera de las tiendas, y yo no alcanzaba a adivinar por qué.</w:t>
+        <w:t>Me quedé de pie y miré hacia donde él miraba, hacia las oscuras fachadas traseras de las tiendas, los escalones cubiertos de ventisqueros y las puertas cerradas. La magia no podía decirme un nombre. Nunca podía. Tenía más corazón que ingenio, decía mi Nick, y no sabía deletrear. Llevaba dos días de pie frente a aquel callejón, y ahora se inclinaba hacia la parte trasera de las tiendas, y yo no alcanzaba a adivinar por qué.</w:t>
       </w:r>
     </w:p>
     <w:p>
@@ -3312,13 +3312,13 @@
     <w:p/>
     <w:p>
       <w:r>
-        <w:t xml:space="preserve">El callejón detrás de los comercios de Evergreen recorría toda la manzana, una franja abierta por la nieve entre las partes traseras de los establecimientos y el muro bajo de los solares de atrás. Lo bastante ancho para una sola furgoneta y nada más. Lo recorrí despacio bajo la luz plana de la mañana, con Pip a mi talón, callada y prudente, y leí las fachadas traseras de los comercios como nunca me había molestado en hacer. Como puertas en lugar de paredes. Ahí estaba la puerta de acero de la farmacia, cerrada con llave y con un timbre. Y aquí las dos que compartían el muelle. El almacén frigorífico de Pete, una vieja habitación de bloques con una aldaba pesada, y el segundo candado que le había comprado a Tom, flamante y nuevo, en la verja. Y tres puertas más allá, la de Greta, baja y de madera, desgastada y pálida en el pomo por cuarenta años de mano enfarinada.</w:t>
-      </w:r>
-    </w:p>
-    <w:p/>
-    <w:p>
-      <w:r>
-        <w:t>Me detuve ante la puerta trasera de Greta en el frío y observé lo que cualquiera que estuviera allí vería. El umbral por donde bajaban los sacos. La oscuridad de la trastienda más allá. Y a través de la estancia, pequeña y brillante, a lo lejos, la boca de sus hornos, donde ella estaría. Una persona en este umbral en la oscuridad tendría todo el cálido corazón de su tienda dispuesto como un escenario, y a sí misma en bambalinas, donde la luz no llegaba. La vería antes de que ella pudiera verle. Oiría los ventiladores y sabría que ella no podía oírle. Y tendría todo el tiempo del mundo.</w:t>
+        <w:t xml:space="preserve">El callejón detrás de los comercios de Evergreen recorría toda la manzana, una franja abierta por la nieve entre las partes traseras de los establecimientos y el muro bajo de los solares de atrás. Lo bastante ancho para una sola furgoneta y nada más. Lo recorrí despacio bajo la luz plana de la mañana, con Pip a mi talón, callada y prudente, y leí las fachadas traseras de los comercios como nunca me había molestado en hacer. Como puertas en lugar de paredes. Ahí estaba la puerta de acero de la farmacia, cerrada con llave y con un timbre. Y aquí las dos que compartían el muelle. El almacén frigorífico de Pete, una vieja habitación de bloques con una aldaba pesada, y el segundo candado que le había comprado a Tom, flamante y nuevo, en la verja. Y tres puertas más allá, la de Greta, baja y de madera, desgastada y pálida en el pomo por cuarenta años de mano enharinada.</w:t>
+      </w:r>
+    </w:p>
+    <w:p/>
+    <w:p>
+      <w:r>
+        <w:t>Me detuve ante la puerta trasera de Greta en el frío y observé lo que cualquiera que estuviera allí vería. El umbral por donde bajaban los sacos. La oscuridad de la trastienda más allá. Y a través de la estancia, pequeña y brillante, a lo lejos, la boca de sus hornos, donde ella estaría. Alguien en este umbral en la oscuridad tendría todo el cálido corazón de su tienda dispuesto como un escenario, y a sí mismo en bambalinas, donde la luz no llegaba. La vería antes de que ella pudiera verle. Oiría los ventiladores y sabría que ella no podía oírle. Y tendría todo el tiempo del mundo.</w:t>
       </w:r>
     </w:p>
     <w:p/>
@@ -3372,7 +3372,7 @@
     <w:p/>
     <w:p>
       <w:r>
-        <w:t>No lo disfrutaba. Ya lo había dado medio por inocente antes siquiera de saber que la harina estaba adulterada. Frente al plano mapa del acceso, esa amabilidad a medias no se sostenía.</w:t>
+        <w:t>No lo disfrutaba. Ya lo había dado medio por inocente antes siquiera de saber que la harina estaba adulterada. Frente al simple mapa del acceso, esa amabilidad a medias no se sostenía.</w:t>
       </w:r>
     </w:p>
     <w:p/>
@@ -3432,7 +3432,7 @@
     <w:p/>
     <w:p>
       <w:r>
-        <w:t xml:space="preserve">Al fondo del extremo de la manzana, una furgoneta de reparto de panadería se detuvo junto al bordillo frente al Holly Jolly, con el rótulo </w:t>
+        <w:t xml:space="preserve">Al fondo del extremo de la manzana, una furgoneta de reparto de panadería estaba parada junto al bordillo frente al Holly Jolly, con el rótulo </w:t>
       </w:r>
       <w:r>
         <w:rPr>
@@ -3846,7 +3846,7 @@
     <w:p/>
     <w:p>
       <w:r>
-        <w:t>El círculo se reunió esa tarde sin coronas de adorno. Olivia había estado llamando por teléfono por la tarde: solo punto, porque el barril de ropa de abrigo de Hal se había vaciado dos veces en una semana y las familias de la colina necesitaban gorros. Así que los bastidores se quedaron apilados en el cuarto trasero, y las siete arrimamos nuestras sillas alrededor de la estufa con las agujas y todos los ovillos sobrantes de la tienda.</w:t>
+        <w:t>El círculo se reunió esa tarde sin coronas de adorno. Olivia había estado llamando por teléfono por la tarde: solo punto, porque el barril de ropa de abrigo de Hal se había vaciado dos veces en una semana y las familias de la colina necesitaban gorros. Así que los armazones se quedaron apilados en el cuarto trasero, y las siete arrimamos nuestras sillas alrededor de la estufa con las agujas y todos los ovillos sobrantes de la tienda.</w:t>
       </w:r>
     </w:p>
     <w:p/>
@@ -3966,7 +3966,7 @@
     <w:p/>
     <w:p>
       <w:r>
-        <w:t>—Cuatro cincuenta clavados. Y una cola que salía por la puerta —Ivy giró su aguja—. Estaba buenísimo. Odié lo bueno que estaba.</w:t>
+        <w:t>—Cuatro cincuenta clavados. Y una cola que salía por la puerta. —Ivy giró su aguja—. Estaba buenísimo. Odié lo bueno que estaba.</w:t>
       </w:r>
     </w:p>
     <w:p/>
@@ -4038,7 +4038,7 @@
     <w:p/>
     <w:p>
       <w:r>
-        <w:t>—Bien —Martha terminó su vuelta—. Hará falta alguien que se lo recuerde.</w:t>
+        <w:t>—Bien. —Martha terminó su vuelta—. Hará falta alguien que se lo recuerde.</w:t>
       </w:r>
     </w:p>
     <w:p/>
@@ -4496,7 +4496,7 @@
     <w:p/>
     <w:p>
       <w:r>
-        <w:t xml:space="preserve">La lechada. El burlete. El lavamanos dos grados por debajo de lo reglamentario por una tubería vieja. Había mencionado los tres en orden, con la jerga profesional, exactamente como Varney los había enumerado en su lista. Exactamente como la denuncia mecanografiada los describía antes de que nadie hubiera puesto un pie en la puerta de Greta.</w:t>
+        <w:t xml:space="preserve">La lechada. El burlete. El lavamanos dos grados por debajo de lo reglamentario por una tubería vieja. Había mencionado los tres en orden, con la jerga profesional, exactamente como Varney los había enumerado en su lista. Exactamente como la denuncia mecanografiada los describía antes de que el inspector hubiera puesto un pie en la puerta de Greta.</w:t>
       </w:r>
     </w:p>
     <w:p/>
@@ -4562,7 +4562,7 @@
     <w:p/>
     <w:p>
       <w:r>
-        <w:t>Ahí estaba otra vez. Y un destello furtivo al decirlo. Sentimiento de propietaria. Una mujer contemplando su avenida desde la atalaya de un negocio que ya daba por suyo. Luego se esfumó, recubierto de nuevo por la cordialidad, y volvió a ser simplemente una anfitriona despidiendo a una vieja vecina.</w:t>
+        <w:t>Ahí estaba otra vez. Y un destello furtivo al decirlo. Sentimiento de propietaria. Una mujer que miraba avenida abajo un negocio que ya daba por suyo. Luego se esfumó, recubierto de nuevo por la cordialidad, y volvió a ser simplemente una anfitriona despidiendo a una vieja vecina.</w:t>
       </w:r>
     </w:p>
     <w:p/>
@@ -4675,7 +4675,7 @@
     <w:p/>
     <w:p>
       <w:r>
-        <w:t xml:space="preserve">—Hubo una mañana en que vi a alguien en la parte trasera de la panadería de Greta. Muy oscuro, antes de que sus hornos se pusieran en marcha, sin luz en su ventana todavía. Alguien adulto, con delantal de panadero. No Greta. Greta es ancha, y esta persona era delgada. Rápida y pulcra, no como alguien que empieza un turno. Un delantal largo, de esos que llegan hasta las espinillas, pálido, con un abrigo debajo. Se quedó un minuto en su escalón trasero, y luego subió por el callejón hacia el extremo lejano. No entró en ninguna parte. La perdí de vista pasado el foco de la farmacia. —Frunció el ceño—. Supuse que era un reparto.</w:t>
+        <w:t xml:space="preserve">—Hubo una mañana en que vi a alguien en la parte trasera de la panadería de Greta. Muy oscuro, antes de que sus hornos se pusieran en marcha, sin luz en su ventana todavía. Alguien adulto, con delantal de panadero. No Greta. Greta es ancha, y esta persona era delgada. De movimientos rápidos y pulcros, no como alguien que empieza un turno. Un delantal largo, de esos que llegan hasta las espinillas, pálido, con un abrigo debajo. Se quedó un minuto en su escalón trasero, y luego subió por el callejón hacia el extremo lejano. No entró en ninguna parte. Le perdí la pista pasado el foco de la farmacia. —Frunció el ceño—. Supuse que era un reparto.</w:t>
       </w:r>
     </w:p>
     <w:p/>
@@ -4900,7 +4900,7 @@
     <w:p/>
     <w:p>
       <w:r>
-        <w:t xml:space="preserve">—Ácido ascórbico y enzimas —dijo—. Una pizca por cada veintitrés kilos. Acondicionador de masa. —Volvió a colocar la tapa—. No es lo que había en la harina de Greta. Un recipiente con base agria se olería en cuanto se quita la tapa. Es penetrante, como el vinagre. Nada en esta estancia huele así.</w:t>
+        <w:t xml:space="preserve">—Ácido ascórbico y enzimas —dijo—. Una pizca por cada veintitrés kilos. Acondicionador de masa. —Volvió a colocar la tapa—. No es lo que había en la harina de Greta. Un recipiente con base agria se olería en cuanto se quitara la tapa. Es penetrante, como el vinagre. Nada en esta estancia huele así.</w:t>
       </w:r>
     </w:p>
     <w:p/>
@@ -5367,7 +5367,7 @@
     </w:p>
     <w:p>
       <w:r>
-        <w:t xml:space="preserve">—El mismo contenedor. Ha estado lleno de sus cartones aplastados desde que montó el local. Inscripciones doradas en cada uno de ellos. He pasado caminando por al lado. —Toqué la tapa del azucarero donde reposaba detrás del pimentero—. Vi una caja dorada en la puerta de Greta y la tomé por Renée allí plantada. Lo único que me indica es que la caja fue suya alguna vez. Todas las cajas de ese contenedor fueron suyas alguna vez.</w:t>
+        <w:t xml:space="preserve">—El mismo contenedor. Ha estado lleno de sus cartones aplastados desde que montó el local. Inscripciones doradas en cada uno de ellos. He pasado caminando por al lado. —Toqué la tapa del azucarero donde reposaba detrás del pimentero—. Vi una caja dorada en la puerta de Greta y di por hecho que Renée había estado allí plantada. Lo único que me indica es que la caja fue suya alguna vez. Todas las cajas de ese contenedor fueron suyas alguna vez.</w:t>
       </w:r>
     </w:p>
     <w:p>
@@ -5786,7 +5786,7 @@
     <w:p/>
     <w:p>
       <w:r>
-        <w:t xml:space="preserve">—Martha recibió una llamada anoche ofreciéndose a prepararle su pedido del Holly Jolly. Dos tartas de chocolate y pacana y una docena de panecillos. Ivy tuvo otra llamada igual, con sus tres tartas de calabaza.</w:t>
+        <w:t xml:space="preserve">—Martha recibió anoche una llamada en la que le ofrecían preparar su pedido del Holly Jolly. Dos tartas de chocolate y pacana y una docena de panecillos. Ivy tuvo otra llamada igual, con sus tres tartas de calabaza.</w:t>
       </w:r>
     </w:p>
     <w:p/>
@@ -5966,7 +5966,7 @@
     <w:p/>
     <w:p>
       <w:r>
-        <w:t>A través del vano de la cocina podía ver la escoba apoyada en su clavo junto a la puerta trasera, a un paso de donde el burlete del suelo se había desgastado y la lechada al pie de la pared del fondo se había agrietado.</w:t>
+        <w:t>A través del vano de la cocina podía ver la escoba colgada de su clavo junto a la puerta trasera, a un paso de donde el burlete del suelo se había desgastado y la lechada al pie de la pared del fondo se había agrietado.</w:t>
       </w:r>
     </w:p>
     <w:p/>
@@ -6316,7 +6316,7 @@
     </w:p>
     <w:p>
       <w:r>
-        <w:t xml:space="preserve">—Cada palabra. Le juro lo de la furgoneta. Lo que no juro es una matrícula que no leí. —Me devolvió la hoja—. ¿De quién es?</w:t>
+        <w:t xml:space="preserve">—Cada palabra. Juraré lo de la furgoneta. Lo que no voy a jurar es una matrícula que no leí. —Me devolvió la hoja—. ¿De quién es?</w:t>
       </w:r>
     </w:p>
     <w:p>
@@ -6440,12 +6440,12 @@
     </w:p>
     <w:p>
       <w:r>
-        <w:t>—El diacetato de sodio es vinagre desecado sobre sal —dijo—. Ese es el vinagre que subió en el humo cuando quemé una pizca el domingo pasado. Y la sal no se quema del todo. Quedó más en el plato de lo que deja la harina sola, y lo anoté en su momento.</w:t>
-      </w:r>
-    </w:p>
-    <w:p>
-      <w:r>
-        <w:t>Bajó el tarro de la balda sobre el banco, donde había estado desde el jueves. Sacudió un poco en un platillo limpio con unas gotas de agua y colocó una tira nueva de papel pH dentro. Se puso rojo tan rápido como antes.</w:t>
+        <w:t>—El diacetato de sodio es vinagre desecado sobre sal —dijo—. Ese es el vinagre que subió en el humo cuando quemé una pizca el domingo pasado. Y la sal no se quema del todo. Quedó más en la cápsula de lo que deja la harina sola, y lo anoté en su momento.</w:t>
+      </w:r>
+    </w:p>
+    <w:p>
+      <w:r>
+        <w:t>Bajó el tarro de la balda sobre el banco, donde había estado desde el jueves. Sacudió un poco en un platillo limpio con unas gotas de agua y colocó una tira nueva de papel pH dentro. Se puso roja tan rápido como antes.</w:t>
       </w:r>
     </w:p>
     <w:p>
@@ -6562,7 +6562,7 @@
     </w:p>
     <w:p>
       <w:r>
-        <w:t xml:space="preserve">—El libro de encargos de Acción de Gracias de Greta estaba abierto en su mostrador la mañana en que rompieron el escaparate —dije—. Joyce Wendt se sentó a su lado con sus gafas de lectura y el teléfono en la mano. El viernes por la tarde, Martha y Ivy recibieron sendas llamadas de una panadería en Bridgton, ofreciéndose a cubrir sus pedidos del Holly Jolly. Hasta las tartas.</w:t>
+        <w:t xml:space="preserve">—El libro de encargos de Acción de Gracias de Greta estaba abierto en su mostrador la mañana en que rompieron el escaparate —dije—. Joyce Wendt se sentó a su lado con sus gafas de lectura y el teléfono en la mano. El viernes por la tarde, Martha y Ivy recibieron sendas llamadas de una panadería de Bridgton que se ofrecía a cubrir sus pedidos del Holly Jolly. Hasta las tartas.</w:t>
       </w:r>
     </w:p>
     <w:p>
@@ -7232,7 +7232,7 @@
         <w:t>Wendt's Bakehouse, Bridgton</w:t>
       </w:r>
       <w:r>
-        <w:t xml:space="preserve"> en el lateral salió marcha atrás del aparcamiento y emprendió el camino de vuelta. Greta la siguió con la mirada hasta la esquina. Luego cogió la pequeña llave de latón que le había hecho a Joyce el año en que abrieron, la sostuvo en la palma de la mano un momento, la guardó en el bolsillo del abrigo y abrochó la solapa por encima.</w:t>
+        <w:t xml:space="preserve"> en el lateral salió marcha atrás del aparcamiento y emprendió el camino de vuelta. Greta la siguió con la mirada hasta la esquina. Luego cogió la pequeña llave de latón que había mandado hacer para Joyce el año en que abrieron, la sostuvo en la palma de la mano un momento, la guardó en el bolsillo del abrigo y abrochó la solapa por encima.</w:t>
       </w:r>
     </w:p>
     <w:p>
@@ -7261,7 +7261,7 @@
     <w:p/>
     <w:p>
       <w:r>
-        <w:t xml:space="preserve">—Dos cargos —dijo Tanaka, y abrió su libreta sobre el secante—. Vandalismo grave. Es la harina, la base agria que ella le metió para arruinar cuatro hornadas de Greta. La ventana entra en el mismo saco. —Ella misma había bajado el ladrillo del estante de la trastienda de Greta por el callejón el domingo y lo había comparado contra los escombros que aún se amontonaban en el contenedor detrás de Sugarplum. El mismo viejo ladrillo rojo, con la misma argamasa gris en una de sus caras—. La pintura no es suya. Eso son unos críos con un aerosol, y es un asunto menor.</w:t>
+        <w:t xml:space="preserve">—Dos cargos —dijo Tanaka, y abrió su cuaderno sobre el secante—. Vandalismo grave. Es la harina, la base agria que ella le metió para arruinar cuatro hornadas de Greta. La ventana entra en el mismo saco. —Ella misma había bajado el ladrillo del estante de la trastienda de Greta por el callejón el domingo y lo había comparado contra los escombros que aún se amontonaban en el contenedor detrás de Sugarplum. El mismo viejo ladrillo rojo, con la misma argamasa gris en una de sus caras—. La pintura no es suya. Eso son unos críos con un aerosol, y es un asunto menor.</w:t>
       </w:r>
     </w:p>
     <w:p/>
@@ -7327,13 +7327,13 @@
     <w:p/>
     <w:p>
       <w:r>
-        <w:t xml:space="preserve">—No que él encontrara. Una base agria es un alimento. Solo arruina la masa equivocada. —Cerró la libreta—. El hospital no espera a un tribunal, sin embargo. El gerente de su servicio de restauración me llamó en cuanto hube abierto la puerta para preguntar si era verdad. Le conté lo que es público, los cargos y la fecha del juicio, y ha suspendido la cuenta. El inspector dice que dos posadas llamaron al repartidor antes de que terminara de cargar la furgoneta. Vio cómo el repartidor volvía a meter el pan dentro.</w:t>
-      </w:r>
-    </w:p>
-    <w:p/>
-    <w:p>
-      <w:r>
-        <w:t>Pip salió de la papelera con un clip y lo dejó sobre el secante al lado de la libreta de Tanaka.</w:t>
+        <w:t xml:space="preserve">—No que él encontrara. Una base agria es un alimento. Solo arruina la masa equivocada. —Cerró el cuaderno—. El hospital no espera a un tribunal, sin embargo. La gerente de su servicio de restauración me llamó en cuanto hube abierto la puerta para preguntar si era verdad. Le conté lo que es público, los cargos y la fecha del juicio, y ha suspendido la cuenta. El inspector dice que dos posadas llamaron al repartidor antes de que terminara de cargar la furgoneta. Vio cómo el repartidor volvía a meter el pan dentro.</w:t>
+      </w:r>
+    </w:p>
+    <w:p/>
+    <w:p>
+      <w:r>
+        <w:t>Pip salió de la papelera con un clip y lo dejó sobre el secante al lado del cuaderno de Tanaka.</w:t>
       </w:r>
     </w:p>
     <w:p/>
@@ -8210,7 +8210,7 @@
     <w:p/>
     <w:p>
       <w:r>
-        <w:t>Greta estaba en la mesa larga entre la harina, con las mangas remangadas hasta los codos, dando forma a una bandeja de galletas en forma de estrella con manos rápidas y seguras. La escarcha había cubierto las esquinas inferiores de las ventanas durante la noche, y los cristales superiores corrían húmedos por el vapor de los hornos. Ya había un grupo de clientes junto al mostrador, abrochándose los abrigos sobre los paquetes, sin prisa por volver a salir al noviembre.</w:t>
+        <w:t>Greta estaba en la mesa larga, cubierta de harina, con las mangas remangadas hasta los codos, dando forma a una bandeja de galletas en forma de estrella con manos rápidas y seguras. La escarcha había cubierto las esquinas inferiores de las ventanas durante la noche, y los cristales superiores corrían húmedos por el vapor de los hornos. Ya había un grupo de clientes junto al mostrador, abrochándose los abrigos sobre los paquetes, sin prisa por volver a salir al noviembre.</w:t>
       </w:r>
     </w:p>
     <w:p/>
@@ -8479,7 +8479,7 @@
     <w:p/>
     <w:p>
       <w:r>
-        <w:t>Dejé mis paquetes y fui hacia él. Me tomó la mano y la puso plana contra las toscas piedras del campo. Estaban templadas bajo mi palma y desprendían un brillo dorado, tal como habían estado desde la noche en que me lo enseñó, con la luz brotando de la piedra desnuda. Y en la chimenea, donde jamás se había colocado nada, unos pocos hilos de oro habían bajado del aire y se extendían a lo largo de las barras de hierro, bajos y constantes, como las primeras brasas de un fuego que nadie había encendido.</w:t>
+        <w:t>Dejé mis paquetes y fui hacia él. Me tomó la mano y la puso plana contra las redondas piedras de campo. Estaban templadas bajo mi palma y desprendían un brillo dorado, tal como habían estado desde la noche en que me lo enseñó, con la luz brotando de la piedra desnuda. Y en la chimenea, donde jamás se había colocado nada, unos pocos hilos de oro habían bajado del aire y se extendían a lo largo de las barras de hierro, bajos y constantes, como las primeras brasas de un fuego que nadie había encendido.</w:t>
       </w:r>
     </w:p>
     <w:p/>

</xml_diff>